<commit_message>
Credit Bestman and Sakly on SynGAP research summary
</commit_message>
<xml_diff>
--- a/files/research-summaries/Smith-SynGAP-PSD95-Research-Summary.docx
+++ b/files/research-summaries/Smith-SynGAP-PSD95-Research-Summary.docx
@@ -19,10 +19,13 @@
         <w:spacing w:after="220"/>
       </w:pPr>
       <w:r>
-        <w:rPr>
-          <w:color w:val="000000"/>
-        </w:rPr>
-        <w:t>Greg Conradi Smith | NSF project on the postsynaptic density</w:t>
+        <w:t>Greg Conradi Smith, Jen Bestman and Sarah Sakly</w:t>
+      </w:r>
+      <w:r>
+        <w:br/>
+      </w:r>
+      <w:r>
+        <w:t>NSF project on the postsynaptic density</w:t>
       </w:r>
     </w:p>
     <w:p>

</xml_diff>

<commit_message>
Revise ongoing SynGAP summary and remove overview PDF link
</commit_message>
<xml_diff>
--- a/files/research-summaries/Smith-SynGAP-PSD95-Research-Summary.docx
+++ b/files/research-summaries/Smith-SynGAP-PSD95-Research-Summary.docx
@@ -34,17 +34,11 @@
           <w:t>https://gregconradismith.github.io/</w:t>
         </w:r>
       </w:hyperlink>
-      <w:r>
-        <w:br/>
-      </w:r>
-      <w:r>
-        <w:t>NSF project on the postsynaptic density</w:t>
-      </w:r>
     </w:p>
     <w:p>
       <w:pPr/>
       <w:r>
-        <w:t>I study how molecular interactions organize the postsynaptic density (PSD), the protein-rich assembly that regulates signalling and plasticity at excitatory synapses. With Jennifer Bestman and graduate student Sarah Sakly, I am developing mathematical and experimental approaches to connect SynGAP–PSD-95 binding and phase separation with synaptic organization and dendritic development. Our NSF-supported project asks how protein variants, dosage and activity-dependent regulation alter the stability and remodelling of these assemblies.</w:t>
+        <w:t>The computational biology laboratory is currently funded to study how molecular interactions organize the postsynaptic density (PSD), the protein-rich assembly that regulates signalling and plasticity at excitatory synapses. With Jennifer Bestman and graduate student Sarah Sakly, I am developing mathematical and experimental approaches to connect SynGAP–PSD-95 binding and phase separation with synaptic organization and dendritic development. Our NSF-supported project asks how protein variants, dosage and activity-dependent regulation alter the stability and remodelling of these assemblies.</w:t>
       </w:r>
     </w:p>
     <w:p>
@@ -73,7 +67,7 @@
     <w:p>
       <w:pPr/>
       <w:r>
-        <w:t>In illustrative simulations, weakening association together with selected interaction changes redistributes SynGAP while preserving a PSD-95-rich phase. In a separate equilibrium comparison, reducing total SynGAP by 50% changes predicted phase compositions while retaining coexistence for the illustrative parameter sets. These results suggest testable mechanisms for remodelling and dosage sensitivity; they are not calibrated predictions of phosphorylation or intact synapses. The manuscript is under revision at Physical Biology.</w:t>
+        <w:t>In illustrative simulations, weakening association together with selected interaction changes redistributes SynGAP while preserving a PSD-95-rich phase. In a separate equilibrium comparison, reducing total SynGAP by 50% changes predicted phase compositions while retaining coexistence for the illustrative parameter sets. These results suggest testable mechanisms for remodelling and dosage sensitivity; they are not calibrated predictions of phosphorylation or intact synapses.</w:t>
       </w:r>
       <w:r>
         <w:rPr>
@@ -96,7 +90,7 @@
     <w:p>
       <w:pPr/>
       <w:r>
-        <w:t>Our NSF project combines three directions: measuring isoform- and variant-dependent phase behaviour; relating condensate organization to dendritic maturation and synaptic function; and developing theory for finite, membrane-associated condensates. Planned experiments include purified-protein phase-separation assays, fluorescence recovery after photobleaching, and live imaging and electrophysiology in the Xenopus retinotectal system. Mathematical extensions will address multivalent network formation, finite-size effects, membrane geometry and exchange with the surrounding cytosol. These studies aim to connect molecular organization with measurable cellular phenotypes relevant to SYNGAP1-associated neurodevelopmental disorders, while providing reusable computational tools and interdisciplinary training. The award supports this work from September 2026 through August 2029.</w:t>
+        <w:t>Our NSF project combines three directions: measuring isoform- and variant-dependent phase behaviour; relating condensate organization to dendritic maturation and synaptic function; and developing theory for finite, membrane-associated condensates. Planned experiments include purified-protein phase-separation assays, fluorescence recovery after photobleaching, and live imaging and electrophysiology in the Xenopus retinotectal system. Mathematical extensions will address multivalent network formation, finite-size effects, membrane geometry and exchange with the surrounding cytosol. These studies aim to connect molecular organization with measurable cellular phenotypes relevant to SYNGAP1-associated neurodevelopmental disorders, while providing reusable computational tools and interdisciplinary training.</w:t>
       </w:r>
     </w:p>
     <w:p>

</xml_diff>